<commit_message>
Update the Connected blocks simulation: new Stacked mode and worksheet Part 4
</commit_message>
<xml_diff>
--- a/25-connected-blocks/worksheet.docx
+++ b/25-connected-blocks/worksheet.docx
@@ -283,7 +283,20 @@
               <w:rPr>
                 <w:sz w:val="20"/>
               </w:rPr>
-              <w:t xml:space="preserve"> homework (≈ 30 min). g = 9.81 N kg⁻¹. Answers to 3 s.f.</w:t>
+              <w:t xml:space="preserve"> homework (≈ 30 min) · </w:t>
+            </w:r>
+            <w:r>
+              <w:rPr>
+                <w:b/>
+                <w:sz w:val="20"/>
+              </w:rPr>
+              <w:t>Part 4</w:t>
+            </w:r>
+            <w:r>
+              <w:rPr>
+                <w:sz w:val="20"/>
+              </w:rPr>
+              <w:t xml:space="preserve"> stacked blocks (≈ 20 min). g = 9.81 N kg⁻¹. Answers to 3 s.f.</w:t>
             </w:r>
           </w:p>
         </w:tc>
@@ -2744,6 +2757,645 @@
         <w:spacing w:after="40"/>
       </w:pPr>
     </w:p>
+    <w:p>
+      <w:pPr>
+        <w:pStyle w:val="Heading1"/>
+      </w:pPr>
+      <w:r>
+        <w:t>Part 4 — Stacked blocks (⑤)</w:t>
+      </w:r>
+    </w:p>
+    <w:p>
+      <w:pPr>
+        <w:spacing w:after="80"/>
+      </w:pPr>
+      <w:r>
+        <w:t xml:space="preserve">Choose ⑤ </w:t>
+      </w:r>
+      <w:r>
+        <w:rPr>
+          <w:b/>
+        </w:rPr>
+        <w:t>Stacked</w:t>
+      </w:r>
+      <w:r>
+        <w:t xml:space="preserve"> at the top. A is the bottom block, B rests on A (C on B). The only horizontal force between two blocks is </w:t>
+      </w:r>
+      <w:r>
+        <w:rPr>
+          <w:b/>
+        </w:rPr>
+        <w:t>friction</w:t>
+      </w:r>
+      <w:r>
+        <w:t>; vertically they push on each other with a normal force. Both come in 3rd-law pairs (same colour in the scene).</w:t>
+      </w:r>
+    </w:p>
+    <w:tbl>
+      <w:tblPr>
+        <w:tblStyle w:val="TableGrid"/>
+        <w:tblW w:type="auto" w:w="0"/>
+        <w:jc w:val="center"/>
+        <w:tblLayout w:type="fixed"/>
+        <w:tblLook w:firstColumn="1" w:firstRow="1" w:lastColumn="0" w:lastRow="0" w:noHBand="0" w:noVBand="1" w:val="04A0"/>
+        <w:tblLayout w:type="fixed"/>
+      </w:tblPr>
+      <w:tblGrid>
+        <w:gridCol w:w="3300"/>
+        <w:gridCol w:w="2100"/>
+        <w:gridCol w:w="2100"/>
+        <w:gridCol w:w="2138"/>
+      </w:tblGrid>
+      <w:tr>
+        <w:trPr>
+          <w:tblHeader/>
+        </w:trPr>
+        <w:tc>
+          <w:tcPr>
+            <w:tcW w:type="dxa" w:w="3300"/>
+            <w:shd w:val="clear" w:color="auto" w:fill="1F3A5F"/>
+            <w:tcMar>
+              <w:top w:w="60" w:type="dxa"/>
+              <w:left w:w="60" w:type="dxa"/>
+              <w:bottom w:w="60" w:type="dxa"/>
+              <w:right w:w="60" w:type="dxa"/>
+            </w:tcMar>
+          </w:tcPr>
+          <w:p>
+            <w:pPr>
+              <w:keepNext/>
+            </w:pPr>
+            <w:r>
+              <w:rPr>
+                <w:b/>
+                <w:color w:val="FFFFFF"/>
+                <w:sz w:val="19"/>
+              </w:rPr>
+              <w:t>Question</w:t>
+            </w:r>
+          </w:p>
+        </w:tc>
+        <w:tc>
+          <w:tcPr>
+            <w:tcW w:type="dxa" w:w="2100"/>
+            <w:shd w:val="clear" w:color="auto" w:fill="1F3A5F"/>
+            <w:tcMar>
+              <w:top w:w="60" w:type="dxa"/>
+              <w:left w:w="60" w:type="dxa"/>
+              <w:bottom w:w="60" w:type="dxa"/>
+              <w:right w:w="60" w:type="dxa"/>
+            </w:tcMar>
+          </w:tcPr>
+          <w:p>
+            <w:pPr>
+              <w:keepNext/>
+            </w:pPr>
+            <w:r>
+              <w:rPr>
+                <w:b/>
+                <w:color w:val="FFFFFF"/>
+                <w:sz w:val="19"/>
+              </w:rPr>
+              <w:t>My prediction (before)</w:t>
+            </w:r>
+          </w:p>
+        </w:tc>
+        <w:tc>
+          <w:tcPr>
+            <w:tcW w:type="dxa" w:w="2100"/>
+            <w:shd w:val="clear" w:color="auto" w:fill="1F3A5F"/>
+            <w:tcMar>
+              <w:top w:w="60" w:type="dxa"/>
+              <w:left w:w="60" w:type="dxa"/>
+              <w:bottom w:w="60" w:type="dxa"/>
+              <w:right w:w="60" w:type="dxa"/>
+            </w:tcMar>
+          </w:tcPr>
+          <w:p>
+            <w:pPr>
+              <w:keepNext/>
+            </w:pPr>
+            <w:r>
+              <w:rPr>
+                <w:b/>
+                <w:color w:val="FFFFFF"/>
+                <w:sz w:val="19"/>
+              </w:rPr>
+              <w:t>What the simulation showed</w:t>
+            </w:r>
+          </w:p>
+        </w:tc>
+        <w:tc>
+          <w:tcPr>
+            <w:tcW w:type="dxa" w:w="2138"/>
+            <w:shd w:val="clear" w:color="auto" w:fill="1F3A5F"/>
+            <w:tcMar>
+              <w:top w:w="60" w:type="dxa"/>
+              <w:left w:w="60" w:type="dxa"/>
+              <w:bottom w:w="60" w:type="dxa"/>
+              <w:right w:w="60" w:type="dxa"/>
+            </w:tcMar>
+          </w:tcPr>
+          <w:p>
+            <w:pPr>
+              <w:keepNext/>
+            </w:pPr>
+            <w:r>
+              <w:rPr>
+                <w:b/>
+                <w:color w:val="FFFFFF"/>
+                <w:sz w:val="19"/>
+              </w:rPr>
+              <w:t>Physics explanation</w:t>
+            </w:r>
+          </w:p>
+        </w:tc>
+      </w:tr>
+      <w:tr>
+        <w:trPr>
+          <w:cantSplit/>
+          <w:trHeight w:val="1247" w:hRule="atLeast"/>
+        </w:trPr>
+        <w:tc>
+          <w:tcPr>
+            <w:tcW w:type="dxa" w:w="3300"/>
+            <w:tcMar>
+              <w:top w:w="60" w:type="dxa"/>
+              <w:left w:w="60" w:type="dxa"/>
+              <w:bottom w:w="60" w:type="dxa"/>
+              <w:right w:w="60" w:type="dxa"/>
+            </w:tcMar>
+          </w:tcPr>
+          <w:p>
+            <w:pPr>
+              <w:keepNext/>
+            </w:pPr>
+            <w:r>
+              <w:rPr>
+                <w:sz w:val="19"/>
+              </w:rPr>
+              <w:t>18. ⑤ You pull the bottom block A; B rests on top. Which force makes B speed up?</w:t>
+            </w:r>
+          </w:p>
+        </w:tc>
+        <w:tc>
+          <w:tcPr>
+            <w:tcW w:type="dxa" w:w="2100"/>
+            <w:tcMar>
+              <w:top w:w="60" w:type="dxa"/>
+              <w:left w:w="60" w:type="dxa"/>
+              <w:bottom w:w="60" w:type="dxa"/>
+              <w:right w:w="60" w:type="dxa"/>
+            </w:tcMar>
+          </w:tcPr>
+          <w:p>
+            <w:pPr>
+              <w:keepNext/>
+            </w:pPr>
+          </w:p>
+        </w:tc>
+        <w:tc>
+          <w:tcPr>
+            <w:tcW w:type="dxa" w:w="2100"/>
+            <w:tcMar>
+              <w:top w:w="60" w:type="dxa"/>
+              <w:left w:w="60" w:type="dxa"/>
+              <w:bottom w:w="60" w:type="dxa"/>
+              <w:right w:w="60" w:type="dxa"/>
+            </w:tcMar>
+          </w:tcPr>
+          <w:p>
+            <w:pPr>
+              <w:keepNext/>
+            </w:pPr>
+          </w:p>
+        </w:tc>
+        <w:tc>
+          <w:tcPr>
+            <w:tcW w:type="dxa" w:w="2138"/>
+            <w:tcMar>
+              <w:top w:w="60" w:type="dxa"/>
+              <w:left w:w="60" w:type="dxa"/>
+              <w:bottom w:w="60" w:type="dxa"/>
+              <w:right w:w="60" w:type="dxa"/>
+            </w:tcMar>
+          </w:tcPr>
+          <w:p>
+            <w:pPr>
+              <w:keepNext/>
+            </w:pPr>
+          </w:p>
+        </w:tc>
+      </w:tr>
+      <w:tr>
+        <w:trPr>
+          <w:cantSplit/>
+          <w:trHeight w:val="1247" w:hRule="atLeast"/>
+        </w:trPr>
+        <w:tc>
+          <w:tcPr>
+            <w:tcW w:type="dxa" w:w="3300"/>
+            <w:tcMar>
+              <w:top w:w="60" w:type="dxa"/>
+              <w:left w:w="60" w:type="dxa"/>
+              <w:bottom w:w="60" w:type="dxa"/>
+              <w:right w:w="60" w:type="dxa"/>
+            </w:tcMar>
+          </w:tcPr>
+          <w:p>
+            <w:pPr>
+              <w:keepNext/>
+            </w:pPr>
+            <w:r>
+              <w:rPr>
+                <w:sz w:val="19"/>
+              </w:rPr>
+              <w:t>19. ⑤ You pull A much harder (situation 23, 30 N). Does B move with A, slide back on A while still moving forwards, or stay at rest?</w:t>
+            </w:r>
+          </w:p>
+        </w:tc>
+        <w:tc>
+          <w:tcPr>
+            <w:tcW w:type="dxa" w:w="2100"/>
+            <w:tcMar>
+              <w:top w:w="60" w:type="dxa"/>
+              <w:left w:w="60" w:type="dxa"/>
+              <w:bottom w:w="60" w:type="dxa"/>
+              <w:right w:w="60" w:type="dxa"/>
+            </w:tcMar>
+          </w:tcPr>
+          <w:p>
+            <w:pPr>
+              <w:keepNext/>
+            </w:pPr>
+          </w:p>
+        </w:tc>
+        <w:tc>
+          <w:tcPr>
+            <w:tcW w:type="dxa" w:w="2100"/>
+            <w:tcMar>
+              <w:top w:w="60" w:type="dxa"/>
+              <w:left w:w="60" w:type="dxa"/>
+              <w:bottom w:w="60" w:type="dxa"/>
+              <w:right w:w="60" w:type="dxa"/>
+            </w:tcMar>
+          </w:tcPr>
+          <w:p>
+            <w:pPr>
+              <w:keepNext/>
+            </w:pPr>
+          </w:p>
+        </w:tc>
+        <w:tc>
+          <w:tcPr>
+            <w:tcW w:type="dxa" w:w="2138"/>
+            <w:tcMar>
+              <w:top w:w="60" w:type="dxa"/>
+              <w:left w:w="60" w:type="dxa"/>
+              <w:bottom w:w="60" w:type="dxa"/>
+              <w:right w:w="60" w:type="dxa"/>
+            </w:tcMar>
+          </w:tcPr>
+          <w:p>
+            <w:pPr>
+              <w:keepNext/>
+            </w:pPr>
+          </w:p>
+        </w:tc>
+      </w:tr>
+      <w:tr>
+        <w:trPr>
+          <w:cantSplit/>
+          <w:trHeight w:val="1247" w:hRule="atLeast"/>
+        </w:trPr>
+        <w:tc>
+          <w:tcPr>
+            <w:tcW w:type="dxa" w:w="3300"/>
+            <w:tcMar>
+              <w:top w:w="60" w:type="dxa"/>
+              <w:left w:w="60" w:type="dxa"/>
+              <w:bottom w:w="60" w:type="dxa"/>
+              <w:right w:w="60" w:type="dxa"/>
+            </w:tcMar>
+          </w:tcPr>
+          <w:p>
+            <w:r>
+              <w:rPr>
+                <w:sz w:val="19"/>
+              </w:rPr>
+              <w:t>20. ⑤ You pull the top block B; A stands on a floor with μ</w:t>
+            </w:r>
+            <w:r>
+              <w:rPr>
+                <w:sz w:val="19"/>
+                <w:vertAlign w:val="subscript"/>
+              </w:rPr>
+              <w:t>s</w:t>
+            </w:r>
+            <w:r>
+              <w:rPr>
+                <w:sz w:val="19"/>
+              </w:rPr>
+              <w:t xml:space="preserve"> = 0.20. Does A move?</w:t>
+            </w:r>
+          </w:p>
+        </w:tc>
+        <w:tc>
+          <w:tcPr>
+            <w:tcW w:type="dxa" w:w="2100"/>
+            <w:tcMar>
+              <w:top w:w="60" w:type="dxa"/>
+              <w:left w:w="60" w:type="dxa"/>
+              <w:bottom w:w="60" w:type="dxa"/>
+              <w:right w:w="60" w:type="dxa"/>
+            </w:tcMar>
+          </w:tcPr>
+          <w:p/>
+        </w:tc>
+        <w:tc>
+          <w:tcPr>
+            <w:tcW w:type="dxa" w:w="2100"/>
+            <w:tcMar>
+              <w:top w:w="60" w:type="dxa"/>
+              <w:left w:w="60" w:type="dxa"/>
+              <w:bottom w:w="60" w:type="dxa"/>
+              <w:right w:w="60" w:type="dxa"/>
+            </w:tcMar>
+          </w:tcPr>
+          <w:p/>
+        </w:tc>
+        <w:tc>
+          <w:tcPr>
+            <w:tcW w:type="dxa" w:w="2138"/>
+            <w:tcMar>
+              <w:top w:w="60" w:type="dxa"/>
+              <w:left w:w="60" w:type="dxa"/>
+              <w:bottom w:w="60" w:type="dxa"/>
+              <w:right w:w="60" w:type="dxa"/>
+            </w:tcMar>
+          </w:tcPr>
+          <w:p/>
+        </w:tc>
+      </w:tr>
+    </w:tbl>
+    <w:p>
+      <w:pPr>
+        <w:spacing w:after="40"/>
+      </w:pPr>
+    </w:p>
+    <w:p>
+      <w:pPr>
+        <w:keepNext/>
+        <w:spacing w:after="80"/>
+      </w:pPr>
+      <w:r>
+        <w:rPr>
+          <w:b/>
+        </w:rPr>
+        <w:t>21. (Forces in 30 situations, 23)</w:t>
+      </w:r>
+      <w:r>
+        <w:t xml:space="preserve"> A (4.0 kg) is on a smooth floor; B (1.0 kg) rests on it; between them μ</w:t>
+      </w:r>
+      <w:r>
+        <w:rPr>
+          <w:vertAlign w:val="subscript"/>
+        </w:rPr>
+        <w:t>s</w:t>
+      </w:r>
+      <w:r>
+        <w:t xml:space="preserve"> = 0.40, μ</w:t>
+      </w:r>
+      <w:r>
+        <w:rPr>
+          <w:vertAlign w:val="subscript"/>
+        </w:rPr>
+        <w:t>d</w:t>
+      </w:r>
+      <w:r>
+        <w:t xml:space="preserve"> = 0.30. (a) A is pulled with 15 N and B moves with it. Calculate the acceleration and the friction force on B. State its 3rd-law partner. (b) Calculate the largest pull for which B does not slide. (c) The pull is 30 N. Calculate the acceleration of each block. Check: ⑤ → </w:t>
+      </w:r>
+      <w:r>
+        <w:rPr>
+          <w:i/>
+        </w:rPr>
+        <w:t>Situation 23</w:t>
+      </w:r>
+      <w:r>
+        <w:t xml:space="preserve"> (15 N, the limit, 30 N).</w:t>
+      </w:r>
+    </w:p>
+    <w:tbl>
+      <w:tblPr>
+        <w:tblStyle w:val="TableGrid"/>
+        <w:tblW w:type="auto" w:w="0"/>
+        <w:jc w:val="center"/>
+        <w:tblLayout w:type="fixed"/>
+        <w:tblLook w:firstColumn="1" w:firstRow="1" w:lastColumn="0" w:lastRow="0" w:noHBand="0" w:noVBand="1" w:val="04A0"/>
+        <w:tblLayout w:type="fixed"/>
+      </w:tblPr>
+      <w:tblGrid>
+        <w:gridCol w:w="9638"/>
+      </w:tblGrid>
+      <w:tr>
+        <w:trPr>
+          <w:cantSplit/>
+          <w:trHeight w:val="3515" w:hRule="exact"/>
+        </w:trPr>
+        <w:tc>
+          <w:tcPr>
+            <w:tcW w:type="dxa" w:w="9638"/>
+            <w:tcMar>
+              <w:top w:w="60" w:type="dxa"/>
+              <w:left w:w="60" w:type="dxa"/>
+              <w:bottom w:w="60" w:type="dxa"/>
+              <w:right w:w="60" w:type="dxa"/>
+            </w:tcMar>
+          </w:tcPr>
+          <w:p>
+            <w:r>
+              <w:rPr>
+                <w:color w:val="909090"/>
+                <w:sz w:val="16"/>
+              </w:rPr>
+              <w:t>Working: FBD of B (only friction acts on it horizontally) → whole system</w:t>
+            </w:r>
+          </w:p>
+        </w:tc>
+      </w:tr>
+    </w:tbl>
+    <w:p>
+      <w:pPr>
+        <w:spacing w:after="40"/>
+      </w:pPr>
+    </w:p>
+    <w:p>
+      <w:pPr>
+        <w:keepNext/>
+        <w:spacing w:after="80"/>
+      </w:pPr>
+      <w:r>
+        <w:rPr>
+          <w:b/>
+        </w:rPr>
+        <w:t>22. (Card M★★★)</w:t>
+      </w:r>
+      <w:r>
+        <w:t xml:space="preserve"> A 50 kg box sits on the flat bed of a truck, 2.0 m behind the cab; μ</w:t>
+      </w:r>
+      <w:r>
+        <w:rPr>
+          <w:vertAlign w:val="subscript"/>
+        </w:rPr>
+        <w:t>s</w:t>
+      </w:r>
+      <w:r>
+        <w:t xml:space="preserve"> = 0.40, μ</w:t>
+      </w:r>
+      <w:r>
+        <w:rPr>
+          <w:vertAlign w:val="subscript"/>
+        </w:rPr>
+        <w:t>d</w:t>
+      </w:r>
+      <w:r>
+        <w:t xml:space="preserve"> = 0.30. (a) Calculate the largest acceleration of the truck for which the box does not slide. Which force accelerates the box? (b) The truck brakes at 5.0 m s⁻². Show that the box slides. (c) Calculate the box's acceleration relative to the truck and the time until it hits the cab. Check: ⑤ → </w:t>
+      </w:r>
+      <w:r>
+        <w:rPr>
+          <w:i/>
+        </w:rPr>
+        <w:t>Card M★★★ (a)</w:t>
+      </w:r>
+      <w:r>
+        <w:t xml:space="preserve"> and </w:t>
+      </w:r>
+      <w:r>
+        <w:rPr>
+          <w:i/>
+        </w:rPr>
+        <w:t>(b, c)</w:t>
+      </w:r>
+      <w:r>
+        <w:t>.</w:t>
+      </w:r>
+    </w:p>
+    <w:tbl>
+      <w:tblPr>
+        <w:tblStyle w:val="TableGrid"/>
+        <w:tblW w:type="auto" w:w="0"/>
+        <w:jc w:val="center"/>
+        <w:tblLayout w:type="fixed"/>
+        <w:tblLook w:firstColumn="1" w:firstRow="1" w:lastColumn="0" w:lastRow="0" w:noHBand="0" w:noVBand="1" w:val="04A0"/>
+        <w:tblLayout w:type="fixed"/>
+      </w:tblPr>
+      <w:tblGrid>
+        <w:gridCol w:w="9638"/>
+      </w:tblGrid>
+      <w:tr>
+        <w:trPr>
+          <w:cantSplit/>
+          <w:trHeight w:val="3515" w:hRule="exact"/>
+        </w:trPr>
+        <w:tc>
+          <w:tcPr>
+            <w:tcW w:type="dxa" w:w="9638"/>
+            <w:tcMar>
+              <w:top w:w="60" w:type="dxa"/>
+              <w:left w:w="60" w:type="dxa"/>
+              <w:bottom w:w="60" w:type="dxa"/>
+              <w:right w:w="60" w:type="dxa"/>
+            </w:tcMar>
+          </w:tcPr>
+          <w:p>
+            <w:r>
+              <w:rPr>
+                <w:color w:val="909090"/>
+                <w:sz w:val="16"/>
+              </w:rPr>
+              <w:t>Working</w:t>
+            </w:r>
+          </w:p>
+        </w:tc>
+      </w:tr>
+    </w:tbl>
+    <w:p>
+      <w:pPr>
+        <w:spacing w:after="40"/>
+      </w:pPr>
+    </w:p>
+    <w:p>
+      <w:pPr>
+        <w:keepNext/>
+        <w:spacing w:after="80"/>
+      </w:pPr>
+      <w:r>
+        <w:rPr>
+          <w:b/>
+        </w:rPr>
+        <w:t>23.</w:t>
+      </w:r>
+      <w:r>
+        <w:t xml:space="preserve"> Three books (2.0 kg, 1.5 kg and 1.0 kg from the bottom) are pushed along a table at a constant velocity by a force on the bottom book; μ</w:t>
+      </w:r>
+      <w:r>
+        <w:rPr>
+          <w:vertAlign w:val="subscript"/>
+        </w:rPr>
+        <w:t>d</w:t>
+      </w:r>
+      <w:r>
+        <w:t xml:space="preserve"> = 0.30 between the table and the book. Calculate the push, the normal force of the middle book on the bottom book, and the friction force between the books. Check: ⑤ → </w:t>
+      </w:r>
+      <w:r>
+        <w:rPr>
+          <w:i/>
+        </w:rPr>
+        <w:t>Three books</w:t>
+      </w:r>
+      <w:r>
+        <w:t>.</w:t>
+      </w:r>
+    </w:p>
+    <w:tbl>
+      <w:tblPr>
+        <w:tblStyle w:val="TableGrid"/>
+        <w:tblW w:type="auto" w:w="0"/>
+        <w:jc w:val="center"/>
+        <w:tblLayout w:type="fixed"/>
+        <w:tblLook w:firstColumn="1" w:firstRow="1" w:lastColumn="0" w:lastRow="0" w:noHBand="0" w:noVBand="1" w:val="04A0"/>
+        <w:tblLayout w:type="fixed"/>
+      </w:tblPr>
+      <w:tblGrid>
+        <w:gridCol w:w="9638"/>
+      </w:tblGrid>
+      <w:tr>
+        <w:trPr>
+          <w:cantSplit/>
+          <w:trHeight w:val="2494" w:hRule="exact"/>
+        </w:trPr>
+        <w:tc>
+          <w:tcPr>
+            <w:tcW w:type="dxa" w:w="9638"/>
+            <w:tcMar>
+              <w:top w:w="60" w:type="dxa"/>
+              <w:left w:w="60" w:type="dxa"/>
+              <w:bottom w:w="60" w:type="dxa"/>
+              <w:right w:w="60" w:type="dxa"/>
+            </w:tcMar>
+          </w:tcPr>
+          <w:p>
+            <w:r>
+              <w:rPr>
+                <w:color w:val="909090"/>
+                <w:sz w:val="16"/>
+              </w:rPr>
+              <w:t>Working</w:t>
+            </w:r>
+          </w:p>
+        </w:tc>
+      </w:tr>
+    </w:tbl>
     <w:sectPr>
       <w:headerReference w:type="default" r:id="rId9"/>
       <w:footerReference w:type="default" r:id="rId10"/>

</xml_diff>